<commit_message>
Update publications, coursework, and awards from CV v23 and Pitt transcript
- Add arXiv preprint: Blood Pressure Estimation from PPG (Wu, Wang, Kuang, Shapovalenko 2026)
- Replace placeholder Pitt/CMU coursework with actual courses from transcript
- Add 2026 Univ. of Pittsburgh Travel Fund Award; align award percentages with CV
- Refresh downloadable CV (CV_Zhuodiao_Kuang.docx)

Co-Authored-By: Claude Opus 4.8 <noreply@anthropic.com>
</commit_message>
<xml_diff>
--- a/CV_Zhuodiao_Kuang.docx
+++ b/CV_Zhuodiao_Kuang.docx
@@ -330,7 +330,7 @@
           <w:rFonts w:ascii="Times New Roman" w:hAnsi="Times New Roman" w:cs="Times New Roman"/>
           <w:bCs/>
         </w:rPr>
-        <w:t xml:space="preserve">School of Computer Science, Carnegie Mellon University</w:t>
+        <w:t>School of Computer Science, Carnegie Mellon University</w:t>
       </w:r>
     </w:p>
     <w:p>
@@ -360,7 +360,7 @@
           <w:b/>
           <w:bCs/>
         </w:rPr>
-        <w:t xml:space="preserve">M.S. in Biostatistics</w:t>
+        <w:t>M.S. in Biostatistics</w:t>
       </w:r>
     </w:p>
     <w:p>
@@ -464,7 +464,7 @@
           <w:b/>
           <w:bCs/>
         </w:rPr>
-        <w:t xml:space="preserve">B.S. in Statistics</w:t>
+        <w:t>B.S. in Statistics</w:t>
       </w:r>
     </w:p>
     <w:p>
@@ -758,6 +758,25 @@
         <w:rPr>
           <w:rFonts w:ascii="Times New Roman" w:hAnsi="Times New Roman" w:cs="Times New Roman"/>
         </w:rPr>
+        <w:t>2026    University of Pittsburgh</w:t>
+      </w:r>
+      <w:r>
+        <w:rPr>
+          <w:rFonts w:ascii="Times New Roman" w:hAnsi="Times New Roman" w:cs="Times New Roman"/>
+        </w:rPr>
+        <w:t xml:space="preserve"> Travel Fund Award</w:t>
+      </w:r>
+    </w:p>
+    <w:p>
+      <w:pPr>
+        <w:rPr>
+          <w:rFonts w:ascii="Times New Roman" w:hAnsi="Times New Roman" w:cs="Times New Roman"/>
+        </w:rPr>
+      </w:pPr>
+      <w:r>
+        <w:rPr>
+          <w:rFonts w:ascii="Times New Roman" w:hAnsi="Times New Roman" w:cs="Times New Roman"/>
+        </w:rPr>
         <w:t>2025    Chair’s Award from Columbia University Mailman of Public Health (1%)</w:t>
       </w:r>
     </w:p>
@@ -789,7 +808,7 @@
         <w:rPr>
           <w:rFonts w:ascii="Times New Roman" w:hAnsi="Times New Roman" w:cs="Times New Roman" w:hint="eastAsia"/>
         </w:rPr>
-        <w:t>(&lt;5%)</w:t>
+        <w:t>(5%)</w:t>
       </w:r>
       <w:r>
         <w:rPr>
@@ -814,7 +833,7 @@
         <w:rPr>
           <w:rFonts w:ascii="Times New Roman" w:hAnsi="Times New Roman" w:cs="Times New Roman" w:hint="eastAsia"/>
         </w:rPr>
-        <w:t xml:space="preserve">2023    Outstanding</w:t>
+        <w:t>2023    Outstanding</w:t>
       </w:r>
       <w:r>
         <w:rPr>
@@ -899,7 +918,7 @@
         <w:rPr>
           <w:rFonts w:ascii="Times New Roman" w:hAnsi="Times New Roman" w:cs="Times New Roman" w:hint="eastAsia"/>
         </w:rPr>
-        <w:t xml:space="preserve">2022    Baosteel Grand Prize</w:t>
+        <w:t>2022    Baosteel Grand Prize</w:t>
       </w:r>
       <w:r>
         <w:rPr>
@@ -911,7 +930,7 @@
         <w:rPr>
           <w:rFonts w:ascii="Times New Roman" w:hAnsi="Times New Roman" w:cs="Times New Roman" w:hint="eastAsia"/>
         </w:rPr>
-        <w:t>(&lt;5%)</w:t>
+        <w:t>(5%)</w:t>
       </w:r>
       <w:r>
         <w:rPr>
@@ -978,11 +997,19 @@
         </w:rPr>
         <w:t xml:space="preserve"> </w:t>
       </w:r>
-      <w:r>
-        <w:rPr>
-          <w:rFonts w:ascii="Times New Roman" w:hAnsi="Times New Roman" w:cs="Times New Roman" w:hint="eastAsia"/>
-        </w:rPr>
-        <w:t xml:space="preserve">(&lt; 2%)</w:t>
+      <w:proofErr w:type="gramStart"/>
+      <w:r>
+        <w:rPr>
+          <w:rFonts w:ascii="Times New Roman" w:hAnsi="Times New Roman" w:cs="Times New Roman" w:hint="eastAsia"/>
+        </w:rPr>
+        <w:t>( 2</w:t>
+      </w:r>
+      <w:proofErr w:type="gramEnd"/>
+      <w:r>
+        <w:rPr>
+          <w:rFonts w:ascii="Times New Roman" w:hAnsi="Times New Roman" w:cs="Times New Roman" w:hint="eastAsia"/>
+        </w:rPr>
+        <w:t>%)</w:t>
       </w:r>
       <w:r>
         <w:rPr>
@@ -1104,7 +1131,7 @@
         <w:rPr>
           <w:rFonts w:ascii="Times New Roman" w:hAnsi="Times New Roman" w:cs="Times New Roman"/>
         </w:rPr>
-        <w:t xml:space="preserve">2020    Undergraduate Entrepreneurship Scholarship</w:t>
+        <w:t>2020    Undergraduate Entrepreneurship Scholarship</w:t>
       </w:r>
       <w:r>
         <w:rPr>
@@ -1232,63 +1259,7 @@
         <w:rPr>
           <w:rFonts w:ascii="Times New Roman" w:hAnsi="Times New Roman" w:cs="Times New Roman"/>
         </w:rPr>
-        <w:t xml:space="preserve">+, Tang L, Ding Y (2026+) Conformal Inference of Individualized Treatment Rules under Distributional Shift. Biostatistics. Under Review.</w:t>
-      </w:r>
-    </w:p>
-    <w:p>
-      <w:pPr>
-        <w:rPr>
-          <w:rFonts w:ascii="Times New Roman" w:hAnsi="Times New Roman" w:cs="Times New Roman"/>
-        </w:rPr>
-      </w:pPr>
-      <w:r>
-        <w:rPr>
-          <w:rFonts w:ascii="Times New Roman" w:hAnsi="Times New Roman" w:cs="Times New Roman"/>
-        </w:rPr>
-        <w:t xml:space="preserve">Bo N+, Zeng L+, </w:t>
-      </w:r>
-      <w:r>
-        <w:rPr>
-          <w:rFonts w:ascii="Times New Roman" w:hAnsi="Times New Roman" w:cs="Times New Roman"/>
-          <w:b/>
-          <w:bCs/>
-        </w:rPr>
-        <w:t>Kuang Z</w:t>
-      </w:r>
-      <w:r>
-        <w:rPr>
-          <w:rFonts w:ascii="Times New Roman" w:hAnsi="Times New Roman" w:cs="Times New Roman"/>
-        </w:rPr>
-        <w:t>, Ding Y (2026+) Deep Learning in Survival Analysis: A Tutorial with Applications to Prediction and Causal Inference. Lifetime Data Analysis. Under Review.</w:t>
-      </w:r>
-    </w:p>
-    <w:p>
-      <w:pPr>
-        <w:rPr>
-          <w:rFonts w:ascii="Times New Roman" w:hAnsi="Times New Roman" w:cs="Times New Roman"/>
-          <w:b/>
-          <w:bCs/>
-        </w:rPr>
-      </w:pPr>
-      <w:r>
-        <w:rPr>
-          <w:rFonts w:ascii="Times New Roman" w:hAnsi="Times New Roman" w:cs="Times New Roman"/>
-        </w:rPr>
-        <w:t xml:space="preserve">Abbas M, Nasar Z, </w:t>
-      </w:r>
-      <w:r>
-        <w:rPr>
-          <w:rFonts w:ascii="Times New Roman" w:hAnsi="Times New Roman" w:cs="Times New Roman"/>
-          <w:b/>
-          <w:bCs/>
-        </w:rPr>
-        <w:t>Kuang Z</w:t>
-      </w:r>
-      <w:r>
-        <w:rPr>
-          <w:rFonts w:ascii="Times New Roman" w:hAnsi="Times New Roman" w:cs="Times New Roman"/>
-        </w:rPr>
-        <w:t xml:space="preserve">, Lu H, Rosenthal D, Butts H (2025) Addressing Food Insecurity Through Community Empowerment in a Staten Island (Richmond County) Neighborhood in New York City Pt. 2, </w:t>
+        <w:t xml:space="preserve">+, Tang L, Ding Y (2026+) Conformal Inference of Individualized Treatment Rules under Distributional Shift. </w:t>
       </w:r>
       <w:r>
         <w:rPr>
@@ -1296,6 +1267,165 @@
           <w:i/>
           <w:iCs/>
         </w:rPr>
+        <w:t>Biostatistics.</w:t>
+      </w:r>
+      <w:r>
+        <w:rPr>
+          <w:rFonts w:ascii="Times New Roman" w:hAnsi="Times New Roman" w:cs="Times New Roman"/>
+        </w:rPr>
+        <w:t xml:space="preserve"> Under Review.</w:t>
+      </w:r>
+    </w:p>
+    <w:p>
+      <w:pPr>
+        <w:rPr>
+          <w:rFonts w:ascii="Times New Roman" w:hAnsi="Times New Roman" w:cs="Times New Roman"/>
+        </w:rPr>
+      </w:pPr>
+      <w:r>
+        <w:rPr>
+          <w:rFonts w:ascii="Times New Roman" w:hAnsi="Times New Roman" w:cs="Times New Roman"/>
+        </w:rPr>
+        <w:t xml:space="preserve">Bo N+, Zeng L+, </w:t>
+      </w:r>
+      <w:r>
+        <w:rPr>
+          <w:rFonts w:ascii="Times New Roman" w:hAnsi="Times New Roman" w:cs="Times New Roman"/>
+          <w:b/>
+          <w:bCs/>
+        </w:rPr>
+        <w:t>Kuang Z</w:t>
+      </w:r>
+      <w:r>
+        <w:rPr>
+          <w:rFonts w:ascii="Times New Roman" w:hAnsi="Times New Roman" w:cs="Times New Roman"/>
+        </w:rPr>
+        <w:t xml:space="preserve">, Ding Y (2026+) Deep Learning in Survival Analysis: A Tutorial with Applications to Prediction and Causal Inference. </w:t>
+      </w:r>
+      <w:r>
+        <w:rPr>
+          <w:rFonts w:ascii="Times New Roman" w:hAnsi="Times New Roman" w:cs="Times New Roman"/>
+          <w:i/>
+          <w:iCs/>
+        </w:rPr>
+        <w:t>Lifetime Data Analysis.</w:t>
+      </w:r>
+      <w:r>
+        <w:rPr>
+          <w:rFonts w:ascii="Times New Roman" w:hAnsi="Times New Roman" w:cs="Times New Roman"/>
+        </w:rPr>
+        <w:t xml:space="preserve"> Under Review.</w:t>
+      </w:r>
+    </w:p>
+    <w:p>
+      <w:pPr>
+        <w:rPr>
+          <w:rFonts w:ascii="Times New Roman" w:hAnsi="Times New Roman" w:cs="Times New Roman"/>
+        </w:rPr>
+      </w:pPr>
+      <w:r>
+        <w:rPr>
+          <w:rFonts w:ascii="Times New Roman" w:hAnsi="Times New Roman" w:cs="Times New Roman"/>
+        </w:rPr>
+        <w:t xml:space="preserve">Wu B, Wang H, </w:t>
+      </w:r>
+      <w:r>
+        <w:rPr>
+          <w:rFonts w:ascii="Times New Roman" w:hAnsi="Times New Roman" w:cs="Times New Roman"/>
+          <w:b/>
+          <w:bCs/>
+        </w:rPr>
+        <w:t>Kuang Z</w:t>
+      </w:r>
+      <w:r>
+        <w:rPr>
+          <w:rFonts w:ascii="Times New Roman" w:hAnsi="Times New Roman" w:cs="Times New Roman"/>
+        </w:rPr>
+        <w:t>,</w:t>
+      </w:r>
+      <w:r>
+        <w:rPr>
+          <w:rFonts w:ascii="Times New Roman" w:hAnsi="Times New Roman" w:cs="Times New Roman"/>
+        </w:rPr>
+        <w:t xml:space="preserve"> </w:t>
+      </w:r>
+      <w:proofErr w:type="spellStart"/>
+      <w:r>
+        <w:rPr>
+          <w:rFonts w:ascii="Times New Roman" w:hAnsi="Times New Roman" w:cs="Times New Roman"/>
+        </w:rPr>
+        <w:t>Shapovalenko</w:t>
+      </w:r>
+      <w:proofErr w:type="spellEnd"/>
+      <w:r>
+        <w:rPr>
+          <w:rFonts w:ascii="Times New Roman" w:hAnsi="Times New Roman" w:cs="Times New Roman"/>
+        </w:rPr>
+        <w:t xml:space="preserve"> K (2026) </w:t>
+      </w:r>
+      <w:r>
+        <w:rPr>
+          <w:rFonts w:ascii="Times New Roman" w:hAnsi="Times New Roman" w:cs="Times New Roman"/>
+        </w:rPr>
+        <w:t>Blood Pressure Estimation from PPG: A Comparative Study of Direct and ECG-Mediated Deep Learning Pipelines</w:t>
+      </w:r>
+      <w:r>
+        <w:rPr>
+          <w:rFonts w:ascii="Times New Roman" w:hAnsi="Times New Roman" w:cs="Times New Roman"/>
+        </w:rPr>
+        <w:t xml:space="preserve">. </w:t>
+      </w:r>
+      <w:r>
+        <w:rPr>
+          <w:rFonts w:ascii="Times New Roman" w:hAnsi="Times New Roman" w:cs="Times New Roman"/>
+          <w:i/>
+          <w:iCs/>
+        </w:rPr>
+        <w:t>arXiv:2607.23406</w:t>
+      </w:r>
+      <w:r>
+        <w:rPr>
+          <w:rFonts w:ascii="Times New Roman" w:hAnsi="Times New Roman" w:cs="Times New Roman"/>
+          <w:i/>
+          <w:iCs/>
+        </w:rPr>
+        <w:t>.</w:t>
+      </w:r>
+    </w:p>
+    <w:p>
+      <w:pPr>
+        <w:rPr>
+          <w:rFonts w:ascii="Times New Roman" w:hAnsi="Times New Roman" w:cs="Times New Roman"/>
+          <w:b/>
+          <w:bCs/>
+        </w:rPr>
+      </w:pPr>
+      <w:r>
+        <w:rPr>
+          <w:rFonts w:ascii="Times New Roman" w:hAnsi="Times New Roman" w:cs="Times New Roman"/>
+        </w:rPr>
+        <w:t xml:space="preserve">Abbas M, Nasar Z, </w:t>
+      </w:r>
+      <w:r>
+        <w:rPr>
+          <w:rFonts w:ascii="Times New Roman" w:hAnsi="Times New Roman" w:cs="Times New Roman"/>
+          <w:b/>
+          <w:bCs/>
+        </w:rPr>
+        <w:t>Kuang Z</w:t>
+      </w:r>
+      <w:r>
+        <w:rPr>
+          <w:rFonts w:ascii="Times New Roman" w:hAnsi="Times New Roman" w:cs="Times New Roman"/>
+        </w:rPr>
+        <w:t xml:space="preserve">, Lu H, Rosenthal D, Butts H (2025) Addressing Food Insecurity Through Community Empowerment in a Staten Island (Richmond County) Neighborhood in New York City Pt. 2, </w:t>
+      </w:r>
+      <w:r>
+        <w:rPr>
+          <w:rFonts w:ascii="Times New Roman" w:hAnsi="Times New Roman" w:cs="Times New Roman"/>
+          <w:i/>
+          <w:iCs/>
+        </w:rPr>
         <w:t xml:space="preserve">Journal of Community Health. (minor revisions) </w:t>
       </w:r>
       <w:r>
@@ -1329,7 +1459,7 @@
         <w:rPr>
           <w:rFonts w:ascii="Times New Roman" w:hAnsi="Times New Roman" w:cs="Times New Roman"/>
         </w:rPr>
-        <w:t xml:space="preserve">, Huang Q, Daoyuan L, Gu T (2024) Fast Transfer Learning Method to Leverage Multi-Source Summary-Level Data for Enhanced Risk Prediction. (manuscript in preparation)</w:t>
+        <w:t>, Huang Q, Daoyuan L, Gu T (2024) Fast Transfer Learning Method to Leverage Multi-Source Summary-Level Data for Enhanced Risk Prediction. (manuscript in preparation)</w:t>
       </w:r>
     </w:p>
     <w:p>
@@ -1390,7 +1520,7 @@
         <w:rPr>
           <w:rFonts w:ascii="Times New Roman" w:hAnsi="Times New Roman" w:cs="Times New Roman"/>
         </w:rPr>
-        <w:t xml:space="preserve">rom AlexNet to Hyb-DCNN-ResNet</w:t>
+        <w:t>rom AlexNet to Hyb-DCNN-ResNet</w:t>
       </w:r>
       <w:r>
         <w:rPr>
@@ -1409,7 +1539,7 @@
           <w:rFonts w:ascii="Times New Roman" w:hAnsi="Times New Roman" w:cs="Times New Roman"/>
           <w:i/>
         </w:rPr>
-        <w:t xml:space="preserve">Conference Proceedings Citation Index</w:t>
+        <w:t>Conference Proceedings Citation Index</w:t>
       </w:r>
       <w:r>
         <w:rPr>
@@ -1423,14 +1553,14 @@
           <w:rFonts w:ascii="Times New Roman" w:hAnsi="Times New Roman" w:cs="Times New Roman"/>
           <w:i/>
         </w:rPr>
-        <w:t xml:space="preserve">China National Knowledge Infrastructure</w:t>
+        <w:t>China National Knowledge Infrastructure</w:t>
       </w:r>
       <w:r>
         <w:rPr>
           <w:rFonts w:ascii="Times New Roman" w:hAnsi="Times New Roman" w:cs="Times New Roman" w:hint="eastAsia"/>
           <w:i/>
         </w:rPr>
-        <w:t xml:space="preserve">(CNKI) &amp; 2022 International Conference on Software, Data Processing and Information Technology (SDPIT 20</w:t>
+        <w:t>(CNKI) &amp; 2022 International Conference on Software, Data Processing and Information Technology (SDPIT 20</w:t>
       </w:r>
       <w:r>
         <w:rPr>
@@ -1467,7 +1597,15 @@
           <w:b/>
           <w:bCs/>
         </w:rPr>
+        <w:lastRenderedPageBreak/>
         <w:t>15th International Conference on Health Policy Statistics (ICHPS) | San Diego, CA | 2025</w:t>
+      </w:r>
+      <w:r>
+        <w:rPr>
+          <w:rFonts w:ascii="Times New Roman" w:hAnsi="Times New Roman" w:cs="Times New Roman"/>
+          <w:b/>
+          <w:bCs/>
+        </w:rPr>
         <w:br/>
       </w:r>
       <w:hyperlink r:id="rId10" w:history="1">
@@ -1572,15 +1710,22 @@
           <w:b/>
           <w:bCs/>
         </w:rPr>
-        <w:t xml:space="preserve">Research Assistant</w:t>
+        <w:t>Research Assistant</w:t>
       </w:r>
       <w:r>
         <w:rPr>
           <w:rFonts w:ascii="Times New Roman" w:hAnsi="Times New Roman" w:cs="Times New Roman"/>
         </w:rPr>
         <w:tab/>
-        <w:t xml:space="preserve">09/2025-01/2026</w:t>
-      </w:r>
+      </w:r>
+      <w:bookmarkStart w:id="4" w:name="OLE_LINK2"/>
+      <w:r>
+        <w:rPr>
+          <w:rFonts w:ascii="Times New Roman" w:hAnsi="Times New Roman" w:cs="Times New Roman"/>
+        </w:rPr>
+        <w:t>09/2025-01/2026</w:t>
+      </w:r>
+      <w:bookmarkEnd w:id="4"/>
     </w:p>
     <w:p>
       <w:pPr>
@@ -1596,7 +1741,31 @@
           <w:rFonts w:ascii="Times New Roman" w:hAnsi="Times New Roman" w:cs="Times New Roman"/>
           <w:b/>
         </w:rPr>
-        <w:t xml:space="preserve">Blood Pressure Estimation from PPG: A Comparative Study of Direct and ECG-Mediated Deep Learning Pipelines</w:t>
+        <w:t>Blood Pressure Estimation from PPG</w:t>
+      </w:r>
+      <w:r>
+        <w:rPr>
+          <w:rFonts w:ascii="Times New Roman" w:hAnsi="Times New Roman" w:cs="Times New Roman"/>
+          <w:b/>
+        </w:rPr>
+        <w:t xml:space="preserve"> [</w:t>
+      </w:r>
+      <w:hyperlink r:id="rId11" w:history="1">
+        <w:r>
+          <w:rPr>
+            <w:rStyle w:val="Hyperlink"/>
+            <w:rFonts w:ascii="Times New Roman" w:hAnsi="Times New Roman" w:cs="Times New Roman"/>
+            <w:b/>
+          </w:rPr>
+          <w:t>GitHub</w:t>
+        </w:r>
+      </w:hyperlink>
+      <w:r>
+        <w:rPr>
+          <w:rFonts w:ascii="Times New Roman" w:hAnsi="Times New Roman" w:cs="Times New Roman"/>
+          <w:b/>
+        </w:rPr>
+        <w:t>]</w:t>
       </w:r>
       <w:r>
         <w:rPr>
@@ -1605,43 +1774,63 @@
           <w:i/>
           <w:iCs/>
         </w:rPr>
-        <w:tab/>
-        <w:t xml:space="preserve">Pittsburgh, PA</w:t>
-      </w:r>
-    </w:p>
-    <w:p>
-      <w:pPr>
-        <w:rPr>
-          <w:rFonts w:ascii="Times New Roman" w:hAnsi="Times New Roman" w:cs="Times New Roman"/>
-        </w:rPr>
-      </w:pPr>
-      <w:r>
-        <w:rPr>
-          <w:rFonts w:ascii="Times New Roman" w:hAnsi="Times New Roman" w:cs="Times New Roman"/>
-          <w:b/>
-          <w:bCs/>
-        </w:rPr>
-        <w:t xml:space="preserve">Course Project</w:t>
-      </w:r>
-      <w:r>
-        <w:rPr>
-          <w:rFonts w:ascii="Times New Roman" w:hAnsi="Times New Roman" w:cs="Times New Roman"/>
-        </w:rPr>
-        <w:t xml:space="preserve">: Deep Learning, Carnegie Mellon University</w:t>
-      </w:r>
-    </w:p>
-    <w:p>
-      <w:pPr>
-        <w:rPr>
-          <w:rFonts w:ascii="Times New Roman" w:hAnsi="Times New Roman" w:cs="Times New Roman"/>
-        </w:rPr>
-      </w:pPr>
-      <w:r>
-        <w:rPr>
-          <w:rFonts w:ascii="Times New Roman" w:hAnsi="Times New Roman" w:cs="Times New Roman"/>
-          <w:bCs/>
-        </w:rPr>
-        <w:t xml:space="preserve">Compared two deep-learning pipelines for cuffless blood pressure estimation from photoplethysmography (PPG) signals: a direct PPG-to-BP model and an ECG-mediated model that first reconstructs ECG from PPG before predicting systolic and diastolic pressure. Benchmarked prediction accuracy across both approaches. Submitted to IEEE/ACM CHASE 2026.</w:t>
+        <w:t xml:space="preserve">                                              </w:t>
+      </w:r>
+      <w:r>
+        <w:rPr>
+          <w:rFonts w:ascii="Times New Roman" w:hAnsi="Times New Roman" w:cs="Times New Roman"/>
+          <w:bCs/>
+          <w:i/>
+          <w:iCs/>
+        </w:rPr>
+        <w:t>Pittsburgh, PA</w:t>
+      </w:r>
+    </w:p>
+    <w:p>
+      <w:pPr>
+        <w:rPr>
+          <w:rFonts w:ascii="Times New Roman" w:hAnsi="Times New Roman" w:cs="Times New Roman"/>
+        </w:rPr>
+      </w:pPr>
+      <w:r>
+        <w:rPr>
+          <w:rFonts w:ascii="Times New Roman" w:hAnsi="Times New Roman" w:cs="Times New Roman"/>
+          <w:b/>
+          <w:bCs/>
+        </w:rPr>
+        <w:t>Course Project</w:t>
+      </w:r>
+      <w:r>
+        <w:rPr>
+          <w:rFonts w:ascii="Times New Roman" w:hAnsi="Times New Roman" w:cs="Times New Roman"/>
+        </w:rPr>
+        <w:t xml:space="preserve">: </w:t>
+      </w:r>
+      <w:r>
+        <w:rPr>
+          <w:rFonts w:ascii="Times New Roman" w:hAnsi="Times New Roman" w:cs="Times New Roman"/>
+        </w:rPr>
+        <w:t xml:space="preserve">11-785 Introduction to </w:t>
+      </w:r>
+      <w:r>
+        <w:rPr>
+          <w:rFonts w:ascii="Times New Roman" w:hAnsi="Times New Roman" w:cs="Times New Roman"/>
+        </w:rPr>
+        <w:t>Deep Learning, Carnegie Mellon University</w:t>
+      </w:r>
+    </w:p>
+    <w:p>
+      <w:pPr>
+        <w:rPr>
+          <w:rFonts w:ascii="Times New Roman" w:hAnsi="Times New Roman" w:cs="Times New Roman"/>
+        </w:rPr>
+      </w:pPr>
+      <w:r>
+        <w:rPr>
+          <w:rFonts w:ascii="Times New Roman" w:hAnsi="Times New Roman" w:cs="Times New Roman"/>
+          <w:bCs/>
+        </w:rPr>
+        <w:t>Compared two deep-learning pipelines for cuffless blood pressure estimation from photoplethysmography (PPG) signals: a direct PPG-to-BP model and an ECG-mediated model that first reconstructs ECG from PPG before predicting systolic and diastolic pressure. Benchmarked prediction accuracy across both approaches. Submitted to IEEE/ACM CHASE 2026.</w:t>
       </w:r>
     </w:p>
     <w:p>
@@ -1658,22 +1847,28 @@
         </w:tabs>
         <w:rPr>
           <w:rFonts w:ascii="Times New Roman" w:hAnsi="Times New Roman" w:cs="Times New Roman"/>
-        </w:rPr>
-      </w:pPr>
-      <w:r>
-        <w:rPr>
-          <w:rFonts w:ascii="Times New Roman" w:hAnsi="Times New Roman" w:cs="Times New Roman"/>
-          <w:b/>
-          <w:bCs/>
-        </w:rPr>
-        <w:t xml:space="preserve">Research Assistant</w:t>
+          <w:lang w:eastAsia="zh-TW"/>
+        </w:rPr>
+      </w:pPr>
+      <w:r>
+        <w:rPr>
+          <w:rFonts w:ascii="Times New Roman" w:hAnsi="Times New Roman" w:cs="Times New Roman"/>
+          <w:b/>
+          <w:bCs/>
+        </w:rPr>
+        <w:t>Research Assistant</w:t>
       </w:r>
       <w:r>
         <w:rPr>
           <w:rFonts w:ascii="Times New Roman" w:hAnsi="Times New Roman" w:cs="Times New Roman"/>
         </w:rPr>
         <w:tab/>
-        <w:t xml:space="preserve">09/2025-Present</w:t>
+      </w:r>
+      <w:r>
+        <w:rPr>
+          <w:rFonts w:ascii="Times New Roman" w:hAnsi="Times New Roman" w:cs="Times New Roman"/>
+        </w:rPr>
+        <w:t>09/2025-01/2026</w:t>
       </w:r>
     </w:p>
     <w:p>
@@ -1690,7 +1885,14 @@
           <w:rFonts w:ascii="Times New Roman" w:hAnsi="Times New Roman" w:cs="Times New Roman"/>
           <w:b/>
         </w:rPr>
-        <w:t xml:space="preserve">Modeling the 24-Hour Activity Period and its Association with Cognition in Older Adults</w:t>
+        <w:t>Modeling the 24-Hour Activity Period and its Association with Cognition in Older Adults</w:t>
+      </w:r>
+      <w:r>
+        <w:rPr>
+          <w:rFonts w:ascii="Times New Roman" w:hAnsi="Times New Roman" w:cs="Times New Roman"/>
+          <w:b/>
+        </w:rPr>
+        <w:t xml:space="preserve">          </w:t>
       </w:r>
       <w:r>
         <w:rPr>
@@ -1699,43 +1901,62 @@
           <w:i/>
           <w:iCs/>
         </w:rPr>
-        <w:tab/>
-        <w:t xml:space="preserve">Pittsburgh, PA</w:t>
-      </w:r>
-    </w:p>
-    <w:p>
-      <w:pPr>
-        <w:rPr>
-          <w:rFonts w:ascii="Times New Roman" w:hAnsi="Times New Roman" w:cs="Times New Roman"/>
-        </w:rPr>
-      </w:pPr>
-      <w:r>
-        <w:rPr>
-          <w:rFonts w:ascii="Times New Roman" w:hAnsi="Times New Roman" w:cs="Times New Roman"/>
-          <w:b/>
-          <w:bCs/>
-        </w:rPr>
-        <w:t xml:space="preserve">Advisor</w:t>
-      </w:r>
-      <w:r>
-        <w:rPr>
-          <w:rFonts w:ascii="Times New Roman" w:hAnsi="Times New Roman" w:cs="Times New Roman"/>
-        </w:rPr>
-        <w:t xml:space="preserve">: Prof. Beth Snitz, University of Pittsburgh</w:t>
-      </w:r>
-    </w:p>
-    <w:p>
-      <w:pPr>
-        <w:rPr>
-          <w:rFonts w:ascii="Times New Roman" w:hAnsi="Times New Roman" w:cs="Times New Roman"/>
-        </w:rPr>
-      </w:pPr>
-      <w:r>
-        <w:rPr>
-          <w:rFonts w:ascii="Times New Roman" w:hAnsi="Times New Roman" w:cs="Times New Roman"/>
-          <w:bCs/>
-        </w:rPr>
-        <w:t xml:space="preserve">Modeled 24-hour rest-activity rhythms from wearable accelerometry and examined their association with cognitive function in older adults, linking daily activity patterns to cognitive outcomes. Submitted to the Alzheimer's Association International Conference (AAIC) 2026.</w:t>
+        <w:t>Pittsburgh, PA</w:t>
+      </w:r>
+    </w:p>
+    <w:p>
+      <w:pPr>
+        <w:rPr>
+          <w:rFonts w:ascii="Times New Roman" w:hAnsi="Times New Roman" w:cs="Times New Roman"/>
+        </w:rPr>
+      </w:pPr>
+      <w:r>
+        <w:rPr>
+          <w:rFonts w:ascii="Times New Roman" w:hAnsi="Times New Roman" w:cs="Times New Roman"/>
+          <w:b/>
+          <w:bCs/>
+        </w:rPr>
+        <w:t>Advisor</w:t>
+      </w:r>
+      <w:r>
+        <w:rPr>
+          <w:rFonts w:ascii="Times New Roman" w:hAnsi="Times New Roman" w:cs="Times New Roman"/>
+        </w:rPr>
+        <w:t xml:space="preserve">: Prof. </w:t>
+      </w:r>
+      <w:r>
+        <w:rPr>
+          <w:rFonts w:ascii="Times New Roman" w:hAnsi="Times New Roman" w:cs="Times New Roman"/>
+        </w:rPr>
+        <w:t xml:space="preserve">Marissa A. </w:t>
+      </w:r>
+      <w:proofErr w:type="spellStart"/>
+      <w:r>
+        <w:rPr>
+          <w:rFonts w:ascii="Times New Roman" w:hAnsi="Times New Roman" w:cs="Times New Roman"/>
+        </w:rPr>
+        <w:t>Gogniat</w:t>
+      </w:r>
+      <w:proofErr w:type="spellEnd"/>
+      <w:r>
+        <w:rPr>
+          <w:rFonts w:ascii="Times New Roman" w:hAnsi="Times New Roman" w:cs="Times New Roman"/>
+        </w:rPr>
+        <w:t>, University of Pittsburgh</w:t>
+      </w:r>
+    </w:p>
+    <w:p>
+      <w:pPr>
+        <w:rPr>
+          <w:rFonts w:ascii="Times New Roman" w:hAnsi="Times New Roman" w:cs="Times New Roman"/>
+        </w:rPr>
+      </w:pPr>
+      <w:r>
+        <w:rPr>
+          <w:rFonts w:ascii="Times New Roman" w:hAnsi="Times New Roman" w:cs="Times New Roman"/>
+          <w:bCs/>
+        </w:rPr>
+        <w:t>Modeled 24-hour rest-activity rhythms from wearable accelerometry and examined their association with cognitive function in older adults, linking daily activity patterns to cognitive outcomes. Submitted to the Alzheimer's Association International Conference (AAIC) 2026.</w:t>
       </w:r>
     </w:p>
     <w:p>
@@ -1755,7 +1976,7 @@
           <w:rFonts w:ascii="Times New Roman" w:hAnsi="Times New Roman" w:cs="Times New Roman"/>
         </w:rPr>
       </w:pPr>
-      <w:bookmarkStart w:id="4" w:name="OLE_LINK1"/>
+      <w:bookmarkStart w:id="5" w:name="OLE_LINK1"/>
       <w:r>
         <w:rPr>
           <w:rFonts w:ascii="Times New Roman" w:hAnsi="Times New Roman" w:cs="Times New Roman"/>
@@ -1891,11 +2112,19 @@
         </w:rPr>
         <w:t xml:space="preserve">Prof. </w:t>
       </w:r>
-      <w:r>
-        <w:rPr>
-          <w:rFonts w:ascii="Times New Roman" w:hAnsi="Times New Roman" w:cs="Times New Roman"/>
-        </w:rPr>
-        <w:t xml:space="preserve">Yuanjia Wang, Columbia University Mailman School of Public Health</w:t>
+      <w:proofErr w:type="spellStart"/>
+      <w:r>
+        <w:rPr>
+          <w:rFonts w:ascii="Times New Roman" w:hAnsi="Times New Roman" w:cs="Times New Roman"/>
+        </w:rPr>
+        <w:t>Yuanjia</w:t>
+      </w:r>
+      <w:proofErr w:type="spellEnd"/>
+      <w:r>
+        <w:rPr>
+          <w:rFonts w:ascii="Times New Roman" w:hAnsi="Times New Roman" w:cs="Times New Roman"/>
+        </w:rPr>
+        <w:t xml:space="preserve"> Wang, Columbia University</w:t>
       </w:r>
     </w:p>
     <w:p>
@@ -2102,7 +2331,7 @@
         <w:rPr>
           <w:rFonts w:ascii="Times New Roman" w:hAnsi="Times New Roman" w:cs="Times New Roman"/>
         </w:rPr>
-        <w:t xml:space="preserve">Tian Gu, Columbia University Mailman School of Public Health</w:t>
+        <w:t>Tian Gu, Columbia University</w:t>
       </w:r>
     </w:p>
     <w:p>
@@ -2244,7 +2473,7 @@
           <w:b/>
           <w:bCs/>
         </w:rPr>
-        <w:t xml:space="preserve">rom AlexNet to Hyb-DCNN-ResNet</w:t>
+        <w:t>rom AlexNet to Hyb-DCNN-ResNet</w:t>
       </w:r>
       <w:r>
         <w:rPr>
@@ -2379,24 +2608,38 @@
         </w:rPr>
         <w:t xml:space="preserve"> [</w:t>
       </w:r>
-      <w:r>
-        <w:fldChar w:fldCharType="begin"/>
-        <w:instrText>HYPERLINK "https://github.com/SmartDataLab/Policy_crawler"</w:instrText>
-        <w:fldChar w:fldCharType="separate"/>
-      </w:r>
-      <w:r>
-        <w:rPr>
-          <w:rStyle w:val="Hyperlink"/>
-          <w:rFonts w:ascii="Times New Roman" w:hAnsi="Times New Roman" w:cs="Times New Roman" w:hint="eastAsia"/>
-          <w:b/>
-          <w:bCs/>
-          <w:u w:val="none"/>
-        </w:rPr>
-        <w:t>Github</w:t>
-      </w:r>
-      <w:r>
-        <w:fldChar w:fldCharType="end"/>
-      </w:r>
+      <w:hyperlink r:id="rId12" w:history="1">
+        <w:r>
+          <w:rPr>
+            <w:rStyle w:val="Hyperlink"/>
+            <w:rFonts w:ascii="Times New Roman" w:hAnsi="Times New Roman" w:cs="Times New Roman" w:hint="eastAsia"/>
+            <w:b/>
+            <w:bCs/>
+            <w:u w:val="none"/>
+          </w:rPr>
+          <w:t>Git</w:t>
+        </w:r>
+        <w:r>
+          <w:rPr>
+            <w:rStyle w:val="Hyperlink"/>
+            <w:rFonts w:ascii="Times New Roman" w:hAnsi="Times New Roman" w:cs="Times New Roman"/>
+            <w:b/>
+            <w:bCs/>
+            <w:u w:val="none"/>
+          </w:rPr>
+          <w:t>H</w:t>
+        </w:r>
+        <w:r>
+          <w:rPr>
+            <w:rStyle w:val="Hyperlink"/>
+            <w:rFonts w:ascii="Times New Roman" w:hAnsi="Times New Roman" w:cs="Times New Roman" w:hint="eastAsia"/>
+            <w:b/>
+            <w:bCs/>
+            <w:u w:val="none"/>
+          </w:rPr>
+          <w:t>ub</w:t>
+        </w:r>
+      </w:hyperlink>
       <w:r>
         <w:rPr>
           <w:rFonts w:ascii="Times New Roman" w:hAnsi="Times New Roman" w:cs="Times New Roman" w:hint="eastAsia"/>
@@ -2437,7 +2680,7 @@
         </w:rPr>
         <w:t xml:space="preserve">Supported by 2020 </w:t>
       </w:r>
-      <w:hyperlink r:id="rId11" w:history="1">
+      <w:hyperlink r:id="rId13" w:history="1">
         <w:r>
           <w:rPr>
             <w:rStyle w:val="Hyperlink"/>
@@ -2471,7 +2714,7 @@
         <w:rPr>
           <w:rFonts w:ascii="Times New Roman" w:hAnsi="Times New Roman" w:cs="Times New Roman"/>
         </w:rPr>
-        <w:t xml:space="preserve">Supervisor: Prof. Yanyun Zhao &amp; Hanfang Yang</w:t>
+        <w:t>Supervisor: Prof. Yanyun Zhao &amp; Hanfang Yang</w:t>
       </w:r>
       <w:r>
         <w:rPr>
@@ -2505,7 +2748,7 @@
         <w:t>.</w:t>
       </w:r>
     </w:p>
-    <w:bookmarkEnd w:id="4"/>
+    <w:bookmarkEnd w:id="5"/>
     <w:p>
       <w:pPr>
         <w:rPr>
@@ -2609,7 +2852,7 @@
           <w:rFonts w:ascii="Times New Roman" w:eastAsia="Microsoft YaHei" w:hAnsi="Times New Roman" w:cs="Times New Roman"/>
           <w:sz w:val="22"/>
         </w:rPr>
-        <w:t xml:space="preserve">Python, C, C++, SAS, Stata, Matlab, Excel</w:t>
+        <w:t>Python, C, C++, SAS, Stata, Matlab, Excel</w:t>
       </w:r>
       <w:r>
         <w:rPr>
@@ -5266,6 +5509,27 @@
       <w:jc w:val="both"/>
     </w:pPr>
   </w:style>
+  <w:style w:type="paragraph" w:styleId="Heading1">
+    <w:name w:val="heading 1"/>
+    <w:basedOn w:val="Normal"/>
+    <w:next w:val="Normal"/>
+    <w:link w:val="Heading1Char"/>
+    <w:uiPriority w:val="9"/>
+    <w:qFormat/>
+    <w:rsid w:val="008119B4"/>
+    <w:pPr>
+      <w:keepNext/>
+      <w:keepLines/>
+      <w:spacing w:before="240"/>
+      <w:outlineLvl w:val="0"/>
+    </w:pPr>
+    <w:rPr>
+      <w:rFonts w:asciiTheme="majorHAnsi" w:eastAsiaTheme="majorEastAsia" w:hAnsiTheme="majorHAnsi" w:cstheme="majorBidi"/>
+      <w:color w:val="365F91" w:themeColor="accent1" w:themeShade="BF"/>
+      <w:sz w:val="32"/>
+      <w:szCs w:val="32"/>
+    </w:rPr>
+  </w:style>
   <w:style w:type="paragraph" w:styleId="Heading3">
     <w:name w:val="heading 3"/>
     <w:basedOn w:val="Normal"/>
@@ -5430,6 +5694,19 @@
       <w:color w:val="243F60" w:themeColor="accent1" w:themeShade="7F"/>
       <w:sz w:val="24"/>
       <w:szCs w:val="24"/>
+    </w:rPr>
+  </w:style>
+  <w:style w:type="character" w:customStyle="1" w:styleId="Heading1Char">
+    <w:name w:val="Heading 1 Char"/>
+    <w:basedOn w:val="DefaultParagraphFont"/>
+    <w:link w:val="Heading1"/>
+    <w:uiPriority w:val="9"/>
+    <w:rsid w:val="008119B4"/>
+    <w:rPr>
+      <w:rFonts w:asciiTheme="majorHAnsi" w:eastAsiaTheme="majorEastAsia" w:hAnsiTheme="majorHAnsi" w:cstheme="majorBidi"/>
+      <w:color w:val="365F91" w:themeColor="accent1" w:themeShade="BF"/>
+      <w:sz w:val="32"/>
+      <w:szCs w:val="32"/>
     </w:rPr>
   </w:style>
 </w:styles>

</xml_diff>